<commit_message>
Manuscrito con análisis SHAP en español e inglés
Integración del análisis de interpretabilidad SHAP mediante TreeExplainer al manuscrito.
Se agregaron las secciones 3.6, correspondiente a los métodos SHAP, y 4.4, referente a los resultados SHAP; además, se actualizó la discusión en la sección 5.2.
Se incluyeron seis figuras SHAP: importancia global, importancia por clase y gráficos waterfall.
Se agregó la Tabla 8 con el ranking de biomarcadores SHAP por clase.
Se identificó como hallazgo clave la existencia de roles diferenciados por clase: PC(O-16:0/16:0) para AA, FIT para CCR y CE(20:5) para CTRL.
Se realizó la traducción científica completa al inglés para el envío del manuscrito a Computer Methods and Programs in Biomedicine (CMPB).
Se corrigieron la acentuación, la ortografía y la puntuación de la versión en español.
Se agregaron las referencias [20] Lundberg y Lee, 2017, y [21] Lundberg et al., 2020.
</commit_message>
<xml_diff>
--- a/computer_methods_and_programs_in_biomedicine/Manuscript_CMPB_English.docx
+++ b/computer_methods_and_programs_in_biomedicine/Manuscript_CMPB_English.docx
@@ -46,9 +46,26 @@
       <w:r>
         <w:rPr>
           <w:sz w:val="22"/>
-          <w:highlight w:val="yellow"/>
         </w:rPr>
-        <w:t>Corresponding author: [name], [email], [phone]</w:t>
+        <w:t xml:space="preserve">Corresponding author: </w:t>
+      </w:r>
+      <w:r>
+        <w:rPr>
+          <w:sz w:val="22"/>
+        </w:rPr>
+        <w:t xml:space="preserve">María Virginia Mendizabal Miranda, mmvicky@hotmail.com, </w:t>
+      </w:r>
+      <w:r>
+        <w:rPr>
+          <w:sz w:val="22"/>
+        </w:rPr>
+        <w:br/>
+      </w:r>
+      <w:r>
+        <w:rPr>
+          <w:sz w:val="22"/>
+        </w:rPr>
+        <w:t>+52 744 100 75 96</w:t>
       </w:r>
     </w:p>
     <w:p>
@@ -820,13 +837,8 @@
         <w:jc w:val="both"/>
       </w:pPr>
       <w:r>
-        <w:t xml:space="preserve">The resulting matrix, termed X_intersect, contains 16 variables: 12 lipidomic biomarkers, 2 clinical variables (age, FIT), and 2 categorical indicators (sex, FOB). Table 2 lists the lipidomic biomarkers </w:t>
+        <w:t>The resulting matrix, termed X_intersect, contains 16 variables: 12 lipidomic biomarkers, 2 clinical variables (age, FIT), and 2 categorical indicators (sex, FOB). Table 2 lists the lipidomic biomarkers included.</w:t>
       </w:r>
-      <w:proofErr w:type="spellStart"/>
-      <w:r>
-        <w:t>included.</w:t>
-      </w:r>
-      <w:proofErr w:type="spellEnd"/>
     </w:p>
     <w:p>
       <w:pPr>
@@ -7703,7 +7715,6 @@
   <w:style w:type="character" w:default="1" w:styleId="Fuentedeprrafopredeter">
     <w:name w:val="Default Paragraph Font"/>
     <w:uiPriority w:val="1"/>
-    <w:semiHidden/>
     <w:unhideWhenUsed/>
   </w:style>
   <w:style w:type="table" w:default="1" w:styleId="Tablanormal">

</xml_diff>